<commit_message>
Key slides: show the whole grid sequence; student drafts confirmed
The three "Identifiers for humans" slides (Hunt, The Accident, Ballerina 4)
now carry a compact strip of the full sequence with grid 4 filled in, so the
makers can point at it while walking through the key. Jason's numbers and
Chloe's key are confirmed: draft tags removed from the slides and companion.
PDFs and the Word companion rebuilt.

Co-Authored-By: Claude Fable 5.1 <noreply@anthropic.com>
</commit_message>
<xml_diff>
--- a/docs/files/narratives-workshop-companion.docx
+++ b/docs/files/narratives-workshop-companion.docx
@@ -4498,19 +4498,13 @@
       </w:r>
     </w:p>
     <w:bookmarkEnd w:id="23"/>
-    <w:bookmarkStart w:id="24" w:name="X36703aab0488107291248e5a50d2d5151d17f0d"/>
+    <w:bookmarkStart w:id="24" w:name="what-jason-learned"/>
     <w:p>
       <w:pPr>
         <w:pStyle w:val="Heading4"/>
       </w:pPr>
       <w:r>
         <w:t xml:space="preserve">What Jason learned</w:t>
-      </w:r>
-      <w:r>
-        <w:t xml:space="preserve"> </w:t>
-      </w:r>
-      <w:r>
-        <w:t xml:space="preserve">(numbers updated to the live table; Jason to confirm)</w:t>
       </w:r>
     </w:p>
     <w:p>
@@ -4725,19 +4719,13 @@
         <w:t xml:space="preserve">the ballerina alone at the center (row 3 column 3), and the whole crew in a line across the bottom row.</w:t>
       </w:r>
     </w:p>
-    <w:bookmarkStart w:id="26" w:name="X32e8f8bd0bd56f78c6ff316aa0af4ec12703a07"/>
+    <w:bookmarkStart w:id="26" w:name="reading-the-story-2"/>
     <w:p>
       <w:pPr>
         <w:pStyle w:val="Heading4"/>
       </w:pPr>
       <w:r>
         <w:t xml:space="preserve">Reading the story</w:t>
-      </w:r>
-      <w:r>
-        <w:t xml:space="preserve"> </w:t>
-      </w:r>
-      <w:r>
-        <w:t xml:space="preserve">(draft key, to be confirmed by Chloe)</w:t>
       </w:r>
     </w:p>
     <w:p>

</xml_diff>

<commit_message>
Last-minute edits for the session: drop the tally slide, approve the 2031 stories, QR codes on the closing slide
- Part 5: remove the show-of-hands slide "Which story fits your last month with AI?" (41 slides now); the companion's paragraph on it removed too
- Slide 37: the four 2031 stories are final; draft flag and the companion's draft tag removed
- Closing slide: a QR code above each link (Narrate, NARC puzzles, MindRouter); new docs/img/qr-mindrouter.svg via scripts/make_qr.py
- PDFs and the Word companion rebuilt

Co-Authored-By: Claude Fable 5.1 <noreply@anthropic.com>
</commit_message>
<xml_diff>
--- a/docs/files/narratives-workshop-companion.docx
+++ b/docs/files/narratives-workshop-companion.docx
@@ -7118,26 +7118,6 @@
         <w:t xml:space="preserve">Both stories ask the same two questions. Which friction is the point? And where does the saved time go?</w:t>
       </w:r>
     </w:p>
-    <w:p>
-      <w:pPr>
-        <w:pStyle w:val="BodyText"/>
-      </w:pPr>
-      <w:r>
-        <w:t xml:space="preserve">During the session the room votes by show of hands on which story fits their last month with AI: gym (it made me do the</w:t>
-      </w:r>
-      <w:r>
-        <w:t xml:space="preserve"> </w:t>
-      </w:r>
-      <w:r>
-        <w:t xml:space="preserve">reps), forklift (it lifted what I should have), commute (it took the dull parts), treadmill (saved time, filled it with</w:t>
-      </w:r>
-      <w:r>
-        <w:t xml:space="preserve"> </w:t>
-      </w:r>
-      <w:r>
-        <w:t xml:space="preserve">more), or barely used it.</w:t>
-      </w:r>
-    </w:p>
     <w:bookmarkEnd w:id="38"/>
     <w:bookmarkStart w:id="39" w:name="Xa17c70e04a38319cb9d03330abb2a35d7076fe9"/>
     <w:p>
@@ -7259,19 +7239,13 @@
       </w:r>
     </w:p>
     <w:bookmarkEnd w:id="39"/>
-    <w:bookmarkStart w:id="40" w:name="Xd37f8df9b8f1181ca262d71acbec5eaabe0b30a"/>
+    <w:bookmarkStart w:id="40" w:name="X219b2f295b1dbeeed2fc96ca51d3a48ae6c661c"/>
     <w:p>
       <w:pPr>
         <w:pStyle w:val="Heading3"/>
       </w:pPr>
       <w:r>
         <w:t xml:space="preserve">Stories that look ahead: it’s 2031, and AI went well here. How?</w:t>
-      </w:r>
-      <w:r>
-        <w:t xml:space="preserve"> </w:t>
-      </w:r>
-      <w:r>
-        <w:t xml:space="preserve">(draft examples)</w:t>
       </w:r>
     </w:p>
     <w:p>

</xml_diff>